<commit_message>
CV: independent work since Sep 2026, Twindix to Aug 2026, 2026 operations platforms (Arab Wajam, Escalé, Iqraa, Soyoula, Nazim, Mirqat), updated skills
Co-Authored-By: Claude Fable 5.1 <noreply@anthropic.com>
Claude-Session: https://claude.ai/code/session_01EYJGk8qvxriqbdb6uvegx1
</commit_message>
<xml_diff>
--- a/Ahmed_Beshir_Resume.docx
+++ b/Ahmed_Beshir_Resume.docx
@@ -31,7 +31,7 @@
           <w:sz w:val="22"/>
           <w:szCs w:val="22"/>
         </w:rPr>
-        <w:t xml:space="preserve">Senior Web Developer  •  Shopify &amp; Laravel Specialist</w:t>
+        <w:t>Software Developer  •  Operations Systems &amp; Bilingual Shopify  •  Laravel</w:t>
       </w:r>
     </w:p>
     <w:p>
@@ -150,7 +150,7 @@
           <w:sz w:val="20"/>
           <w:szCs w:val="20"/>
         </w:rPr>
-        <w:t xml:space="preserve">Senior web developer with 10+ years of experience building e-commerce platforms, custom web applications, and internal business tools. Currently at Twindix, rebuilding their core dashboard and delivering new products (Academic Finder, Proposal Builder, Performance) from scratch. Specialist in Shopify (theme development, bilingual AR/EN stores, API integrations) and Laravel (multi-tenant SaaS, dashboards, REST APIs) — comfortable shipping a production-ready bilingual Shopify storefront in a short sprint.</w:t>
+        <w:t>Software developer with 10+ years of experience building the systems that run a business: custom operations platforms on Laravel and bilingual (AR/EN) Shopify stores for companies in Egypt and the Gulf. Since September 2026 I work independently with business owners — a live-interpretation platform for conferences (Arab Wajam), a multi-tenant hotel operations platform with guest and staff mobile apps (Escalé), a remote Qur'an recitation platform with a Telegram bot and live audio (Iqraa), and Shopify operations for Nazim Coffee. Before that I rebuilt Twindix's core dashboard and shipped four products from scratch. I own projects end-to-end: scoping, architecture, backend, APIs, admin UI, integrations, CI and deployment.</w:t>
       </w:r>
     </w:p>
     <w:p>
@@ -187,7 +187,7 @@
           <w:sz w:val="22"/>
           <w:szCs w:val="22"/>
         </w:rPr>
-        <w:t xml:space="preserve">Software Developer</w:t>
+        <w:t>Independent Software Developer</w:t>
       </w:r>
       <w:r>
         <w:rPr>
@@ -205,7 +205,7 @@
           <w:sz w:val="22"/>
           <w:szCs w:val="22"/>
         </w:rPr>
-        <w:t xml:space="preserve">Twindix</w:t>
+        <w:t>Clients in Egypt &amp; the Gulf</w:t>
       </w:r>
       <w:r>
         <w:rPr>
@@ -215,7 +215,8 @@
           <w:sz w:val="20"/>
           <w:szCs w:val="20"/>
         </w:rPr>
-        <w:t xml:space="preserve">	Dec 2025 – Present</w:t>
+        <w:tab/>
+        <w:t>Sep 2026 – Present</w:t>
       </w:r>
     </w:p>
     <w:p>
@@ -230,7 +231,237 @@
           <w:sz w:val="19"/>
           <w:szCs w:val="19"/>
         </w:rPr>
-        <w:t xml:space="preserve">Building and rebuilding the platforms that run Twindix — dashboard, AI tools, proposal system, and ticketing.</w:t>
+        <w:t>Working directly with business owners on the systems that run their operation — scoped, built, deployed and maintained by me.</w:t>
+      </w:r>
+    </w:p>
+    <w:p>
+      <w:pPr>
+        <w:pStyle w:val="ListParagraph"/>
+        <w:numPr>
+          <w:ilvl w:val="0"/>
+          <w:numId w:val="2"/>
+        </w:numPr>
+        <w:spacing w:after="40"/>
+      </w:pPr>
+      <w:r>
+        <w:rPr>
+          <w:b/>
+          <w:bCs/>
+          <w:color w:val="1F3B57"/>
+          <w:sz w:val="20"/>
+          <w:szCs w:val="20"/>
+        </w:rPr>
+        <w:t xml:space="preserve">Arab Wajam (live interpretation &amp; sign-language platform for conferences): </w:t>
+      </w:r>
+      <w:r>
+        <w:rPr>
+          <w:color w:val="333333"/>
+          <w:sz w:val="20"/>
+          <w:szCs w:val="20"/>
+        </w:rPr>
+        <w:t>admin platform on Laravel 12 + Livewire 3 — conferences, control room, live monitor, interpreter roster, quotes and invoices, finance, reports, roles — plus a REST API consumed by a Flutter app for interpreters and attendees. 535 automated tests on GitHub Actions (SQLite + PostgreSQL), staging live, deploy script that refuses to ship without green CI.</w:t>
+      </w:r>
+    </w:p>
+    <w:p>
+      <w:pPr>
+        <w:pStyle w:val="ListParagraph"/>
+        <w:numPr>
+          <w:ilvl w:val="0"/>
+          <w:numId w:val="2"/>
+        </w:numPr>
+        <w:spacing w:after="40"/>
+      </w:pPr>
+      <w:r>
+        <w:rPr>
+          <w:b/>
+          <w:bCs/>
+          <w:color w:val="1F3B57"/>
+          <w:sz w:val="20"/>
+          <w:szCs w:val="20"/>
+        </w:rPr>
+        <w:t xml:space="preserve">Escalé (multi-tenant hotel operations platform): </w:t>
+      </w:r>
+      <w:r>
+        <w:rPr>
+          <w:color w:val="333333"/>
+          <w:sz w:val="20"/>
+          <w:szCs w:val="20"/>
+        </w:rPr>
+        <w:t>five apps in one TypeScript monorepo — guest mobile app, staff mobile app (iOS/Android), hotel admin, public booking site and a B2B agency portal: service requests with SLA tracking, online check-in, live chat, halls/restaurants/transport, finance and audit logs. PostgreSQL + Prisma, Redis, Meilisearch; production deployed with CI and end-to-end tests; launch-ready, first pilot hotel pending.</w:t>
+      </w:r>
+    </w:p>
+    <w:p>
+      <w:pPr>
+        <w:pStyle w:val="ListParagraph"/>
+        <w:numPr>
+          <w:ilvl w:val="0"/>
+          <w:numId w:val="2"/>
+        </w:numPr>
+        <w:spacing w:after="40"/>
+      </w:pPr>
+      <w:r>
+        <w:rPr>
+          <w:b/>
+          <w:bCs/>
+          <w:color w:val="1F3B57"/>
+          <w:sz w:val="20"/>
+          <w:szCs w:val="20"/>
+        </w:rPr>
+        <w:t xml:space="preserve">Iqraa (remote Qur'an recitation circles): </w:t>
+      </w:r>
+      <w:r>
+        <w:rPr>
+          <w:color w:val="333333"/>
+          <w:sz w:val="20"/>
+          <w:szCs w:val="20"/>
+        </w:rPr>
+        <w:t>Laravel 11 platform for an institute — admin distributes students to sheikhs, a Telegram bot links users with a 6-digit code and sends reminders and attendance buttons, live audio sessions in the browser via self-hosted LiveKit with server-side recording, quality reviews, admission quizzes and a finance module (fees, teacher earnings, refunds, payouts, monthly reports). In pre-launch trial.</w:t>
+      </w:r>
+    </w:p>
+    <w:p>
+      <w:pPr>
+        <w:pStyle w:val="ListParagraph"/>
+        <w:numPr>
+          <w:ilvl w:val="0"/>
+          <w:numId w:val="2"/>
+        </w:numPr>
+        <w:spacing w:after="40"/>
+      </w:pPr>
+      <w:r>
+        <w:rPr>
+          <w:b/>
+          <w:bCs/>
+          <w:color w:val="1F3B57"/>
+          <w:sz w:val="20"/>
+          <w:szCs w:val="20"/>
+        </w:rPr>
+        <w:t xml:space="preserve">Nazim Coffee (Shopify operations, ongoing): </w:t>
+      </w:r>
+      <w:r>
+        <w:rPr>
+          <w:color w:val="333333"/>
+          <w:sz w:val="20"/>
+          <w:szCs w:val="20"/>
+        </w:rPr>
+        <w:t>Liquid landing pages for kilo bundles, bilingual promo campaigns with scheduled automations, review migration to Judge.me, Google Ads / GA4 tracking fixes.</w:t>
+      </w:r>
+    </w:p>
+    <w:p>
+      <w:pPr>
+        <w:pStyle w:val="ListParagraph"/>
+        <w:numPr>
+          <w:ilvl w:val="0"/>
+          <w:numId w:val="2"/>
+        </w:numPr>
+        <w:spacing w:after="40"/>
+      </w:pPr>
+      <w:r>
+        <w:rPr>
+          <w:b/>
+          <w:bCs/>
+          <w:color w:val="1F3B57"/>
+          <w:sz w:val="20"/>
+          <w:szCs w:val="20"/>
+        </w:rPr>
+        <w:t xml:space="preserve">Soyoula (COD &amp; affiliate platform): </w:t>
+      </w:r>
+      <w:r>
+        <w:rPr>
+          <w:color w:val="333333"/>
+          <w:sz w:val="20"/>
+          <w:szCs w:val="20"/>
+        </w:rPr>
+        <w:t>Laravel + Livewire platform with three portals (admin, merchant, marketer), product approval workflow, marketer self-pricing with live profit calculation, wallets and payouts, failed-order retries — launched, awaiting first merchants.</w:t>
+      </w:r>
+    </w:p>
+    <w:p>
+      <w:pPr>
+        <w:pStyle w:val="ListParagraph"/>
+        <w:numPr>
+          <w:ilvl w:val="0"/>
+          <w:numId w:val="2"/>
+        </w:numPr>
+        <w:spacing w:after="40"/>
+      </w:pPr>
+      <w:r>
+        <w:rPr>
+          <w:b/>
+          <w:bCs/>
+          <w:color w:val="1F3B57"/>
+          <w:sz w:val="20"/>
+          <w:szCs w:val="20"/>
+        </w:rPr>
+        <w:t xml:space="preserve">Mirqat (personal, free): </w:t>
+      </w:r>
+      <w:r>
+        <w:rPr>
+          <w:color w:val="333333"/>
+          <w:sz w:val="20"/>
+          <w:szCs w:val="20"/>
+        </w:rPr>
+        <w:t>a single-page tool for Qur'an memorizers to master the similar verses — index of every repeated phrase, word-by-word verse comparison, recitation drills with a timed challenge, mistakes notebook, levels and streaks. tashabuh-quran.vercel.app</w:t>
+      </w:r>
+    </w:p>
+    <w:p>
+      <w:pPr>
+        <w:tabs>
+          <w:tab w:val="right" w:pos="9360"/>
+        </w:tabs>
+        <w:spacing w:after="40" w:before="160"/>
+      </w:pPr>
+      <w:r>
+        <w:rPr>
+          <w:b/>
+          <w:bCs/>
+          <w:color w:val="1F3B57"/>
+          <w:sz w:val="22"/>
+          <w:szCs w:val="22"/>
+        </w:rPr>
+        <w:t>Software Developer</w:t>
+      </w:r>
+      <w:r>
+        <w:rPr>
+          <w:color w:val="5A6773"/>
+          <w:sz w:val="22"/>
+          <w:szCs w:val="22"/>
+        </w:rPr>
+        <w:t xml:space="preserve">  •  </w:t>
+      </w:r>
+      <w:r>
+        <w:rPr>
+          <w:b/>
+          <w:bCs/>
+          <w:color w:val="2E75B6"/>
+          <w:sz w:val="22"/>
+          <w:szCs w:val="22"/>
+        </w:rPr>
+        <w:t>Twindix</w:t>
+      </w:r>
+      <w:r>
+        <w:rPr>
+          <w:i/>
+          <w:iCs/>
+          <w:color w:val="5A6773"/>
+          <w:sz w:val="20"/>
+          <w:szCs w:val="20"/>
+        </w:rPr>
+        <w:tab/>
+        <w:t>Dec 2025 – Aug 2026</w:t>
+      </w:r>
+    </w:p>
+    <w:p>
+      <w:pPr>
+        <w:spacing w:after="80"/>
+      </w:pPr>
+      <w:r>
+        <w:rPr>
+          <w:i/>
+          <w:iCs/>
+          <w:color w:val="5A6773"/>
+          <w:sz w:val="19"/>
+          <w:szCs w:val="19"/>
+        </w:rPr>
+        <w:t>Built and rebuilt the platforms that run Twindix — dashboard, AI tools, proposal system, and ticketing.</w:t>
       </w:r>
     </w:p>
     <w:p>
@@ -1322,7 +1553,7 @@
                 <w:sz w:val="19"/>
                 <w:szCs w:val="19"/>
               </w:rPr>
-              <w:t xml:space="preserve">PHP, Laravel 11 (Nova, Telescope, Filament), Python, REST APIs, authentication, payments, queues, Spatie packages.</w:t>
+              <w:t>PHP, Laravel 11/12 (Livewire 3, Filament, Nova, Telescope, Spatie), Python, REST APIs, queues, authentication, payments; TypeScript/Node with Prisma on Escalé.</w:t>
             </w:r>
           </w:p>
         </w:tc>
@@ -1408,7 +1639,7 @@
                 <w:sz w:val="19"/>
                 <w:szCs w:val="19"/>
               </w:rPr>
-              <w:t xml:space="preserve">MySQL, JSON, RESTful API design &amp; integration, webhook pipelines, third-party API integration.</w:t>
+              <w:t>MySQL, PostgreSQL, Redis, Meilisearch, JSON, RESTful API design &amp; integration, webhook pipelines, Telegram bots, LiveKit, third-party API integration.</w:t>
             </w:r>
           </w:p>
         </w:tc>
@@ -1452,7 +1683,7 @@
                 <w:sz w:val="19"/>
                 <w:szCs w:val="19"/>
               </w:rPr>
-              <w:t xml:space="preserve">Git, debugging, message queues, payment integration, SEO, secure coding, scalable architecture.</w:t>
+              <w:t>Git, GitHub Actions CI, Docker, automated tests (PHPUnit, e2e), deploy scripts with rollback, SEO, secure coding, scalable architecture, AI-assisted pair programming.</w:t>
             </w:r>
           </w:p>
         </w:tc>
@@ -1586,6 +1817,161 @@
           <w:sz w:val="21"/>
           <w:szCs w:val="21"/>
         </w:rPr>
+        <w:t>Operations Platforms (2026)</w:t>
+      </w:r>
+    </w:p>
+    <w:p>
+      <w:pPr>
+        <w:pStyle w:val="ListParagraph"/>
+        <w:numPr>
+          <w:ilvl w:val="0"/>
+          <w:numId w:val="2"/>
+        </w:numPr>
+        <w:spacing w:after="40"/>
+      </w:pPr>
+      <w:r>
+        <w:rPr>
+          <w:b/>
+          <w:bCs/>
+          <w:color w:val="1F3B57"/>
+          <w:sz w:val="20"/>
+          <w:szCs w:val="20"/>
+        </w:rPr>
+        <w:t xml:space="preserve">Arab Wajam </w:t>
+      </w:r>
+      <w:r>
+        <w:rPr>
+          <w:color w:val="333333"/>
+          <w:sz w:val="20"/>
+          <w:szCs w:val="20"/>
+        </w:rPr>
+        <w:t>— Laravel 12 + Livewire 3 + PostgreSQL, Flutter app over a REST API; 9 services, CI with 535 tests, protected deploys. Live interpretation and sign-language management for conferences.</w:t>
+      </w:r>
+    </w:p>
+    <w:p>
+      <w:pPr>
+        <w:pStyle w:val="ListParagraph"/>
+        <w:numPr>
+          <w:ilvl w:val="0"/>
+          <w:numId w:val="2"/>
+        </w:numPr>
+        <w:spacing w:after="40"/>
+      </w:pPr>
+      <w:r>
+        <w:rPr>
+          <w:b/>
+          <w:bCs/>
+          <w:color w:val="1F3B57"/>
+          <w:sz w:val="20"/>
+          <w:szCs w:val="20"/>
+        </w:rPr>
+        <w:t xml:space="preserve">Escalé </w:t>
+      </w:r>
+      <w:r>
+        <w:rPr>
+          <w:color w:val="333333"/>
+          <w:sz w:val="20"/>
+          <w:szCs w:val="20"/>
+        </w:rPr>
+        <w:t>— TypeScript monorepo, 5 apps (guest + staff mobile, admin, booking web, B2B portal), PostgreSQL/Prisma, Redis, Meilisearch. escalehotelsys.com</w:t>
+      </w:r>
+    </w:p>
+    <w:p>
+      <w:pPr>
+        <w:pStyle w:val="ListParagraph"/>
+        <w:numPr>
+          <w:ilvl w:val="0"/>
+          <w:numId w:val="2"/>
+        </w:numPr>
+        <w:spacing w:after="40"/>
+      </w:pPr>
+      <w:r>
+        <w:rPr>
+          <w:b/>
+          <w:bCs/>
+          <w:color w:val="1F3B57"/>
+          <w:sz w:val="20"/>
+          <w:szCs w:val="20"/>
+        </w:rPr>
+        <w:t xml:space="preserve">Iqraa </w:t>
+      </w:r>
+      <w:r>
+        <w:rPr>
+          <w:color w:val="333333"/>
+          <w:sz w:val="20"/>
+          <w:szCs w:val="20"/>
+        </w:rPr>
+        <w:t>— Laravel 11 + Telegram bot + LiveKit; remote recitation circles with attendance, recordings and finance.</w:t>
+      </w:r>
+    </w:p>
+    <w:p>
+      <w:pPr>
+        <w:pStyle w:val="ListParagraph"/>
+        <w:numPr>
+          <w:ilvl w:val="0"/>
+          <w:numId w:val="2"/>
+        </w:numPr>
+        <w:spacing w:after="40"/>
+      </w:pPr>
+      <w:r>
+        <w:rPr>
+          <w:b/>
+          <w:bCs/>
+          <w:color w:val="1F3B57"/>
+          <w:sz w:val="20"/>
+          <w:szCs w:val="20"/>
+        </w:rPr>
+        <w:t xml:space="preserve">Soyoula </w:t>
+      </w:r>
+      <w:r>
+        <w:rPr>
+          <w:color w:val="333333"/>
+          <w:sz w:val="20"/>
+          <w:szCs w:val="20"/>
+        </w:rPr>
+        <w:t>— Laravel + Livewire COD &amp; affiliate platform with admin / merchant / marketer portals. soyoula.com</w:t>
+      </w:r>
+    </w:p>
+    <w:p>
+      <w:pPr>
+        <w:pStyle w:val="ListParagraph"/>
+        <w:numPr>
+          <w:ilvl w:val="0"/>
+          <w:numId w:val="2"/>
+        </w:numPr>
+        <w:spacing w:after="40"/>
+      </w:pPr>
+      <w:r>
+        <w:rPr>
+          <w:b/>
+          <w:bCs/>
+          <w:color w:val="1F3B57"/>
+          <w:sz w:val="20"/>
+          <w:szCs w:val="20"/>
+        </w:rPr>
+        <w:t xml:space="preserve">Mirqat </w:t>
+      </w:r>
+      <w:r>
+        <w:rPr>
+          <w:color w:val="333333"/>
+          <w:sz w:val="20"/>
+          <w:szCs w:val="20"/>
+        </w:rPr>
+        <w:t>— free single-page tool for Qur'an memorizers (similar verses, recitation drills, levels). tashabuh-quran.vercel.app</w:t>
+      </w:r>
+    </w:p>
+    <w:p>
+      <w:pPr>
+        <w:spacing w:after="40" w:before="40"/>
+      </w:pPr>
+      <w:r>
+        <w:rPr>
+          <w:b/>
+          <w:bCs/>
+          <w:color w:val="1F3B57"/>
+          <w:sz w:val="21"/>
+          <w:szCs w:val="21"/>
+        </w:rPr>
         <w:t xml:space="preserve">Shopify Storefronts (AR/EN, Bilingual)</w:t>
       </w:r>
     </w:p>
@@ -1721,6 +2107,34 @@
           <w:szCs w:val="20"/>
         </w:rPr>
         <w:t xml:space="preserve">— Shopify customization showcasing Egyptian cotton products with enhanced SEO and responsiveness.</w:t>
+      </w:r>
+    </w:p>
+    <w:p>
+      <w:pPr>
+        <w:pStyle w:val="ListParagraph"/>
+        <w:numPr>
+          <w:ilvl w:val="0"/>
+          <w:numId w:val="2"/>
+        </w:numPr>
+        <w:spacing w:after="40"/>
+      </w:pPr>
+      <w:r>
+        <w:rPr>
+          <w:b/>
+          <w:bCs/>
+          <w:color w:val="1F3B57"/>
+          <w:sz w:val="20"/>
+          <w:szCs w:val="20"/>
+        </w:rPr>
+        <w:t xml:space="preserve">Nazim Coffee </w:t>
+      </w:r>
+      <w:r>
+        <w:rPr>
+          <w:color w:val="333333"/>
+          <w:sz w:val="20"/>
+          <w:szCs w:val="20"/>
+        </w:rPr>
+        <w:t>— Shopify store management: Liquid landing pages, scheduled bilingual campaigns, review migration, ads/GA4 tracking. nazim.coffee</w:t>
       </w:r>
     </w:p>
     <w:p>

</xml_diff>

<commit_message>
Escalé: high-level description only (pre-launch — no feature-by-feature detail public), site EN+AR and CV
Co-Authored-By: Claude Fable 5.1 <noreply@anthropic.com>
Claude-Session: https://claude.ai/code/session_01EYJGk8qvxriqbdb6uvegx1
</commit_message>
<xml_diff>
--- a/Ahmed_Beshir_Resume.docx
+++ b/Ahmed_Beshir_Resume.docx
@@ -150,7 +150,7 @@
           <w:sz w:val="20"/>
           <w:szCs w:val="20"/>
         </w:rPr>
-        <w:t>Software developer with 10+ years of experience building the systems that run a business: custom operations platforms on Laravel and bilingual (AR/EN) Shopify stores for companies in Egypt and the Gulf. Since September 2026 I work independently with business owners — a live-interpretation platform for conferences (Arab Wajam), a multi-tenant hotel operations platform with guest and staff mobile apps (Escalé), a remote Qur'an recitation platform with a Telegram bot and live audio (Iqraa), and Shopify operations for Nazim Coffee. Before that I rebuilt Twindix's core dashboard and shipped four products from scratch. I own projects end-to-end: scoping, architecture, backend, APIs, admin UI, integrations, CI and deployment.</w:t>
+        <w:t>Software developer with 10+ years of experience building the systems that run a business: custom operations platforms on Laravel and bilingual (AR/EN) Shopify stores for companies in Egypt and the Gulf. Since September 2026 I work independently with business owners — a live-interpretation platform for conferences (Arab Wajam), a multi-tenant hospitality platform for hotels and hotel groups with guest and staff mobile apps (Escalé), a remote Qur'an recitation platform with a Telegram bot and live audio (Iqraa), and Shopify operations for Nazim Coffee. Before that I rebuilt Twindix's core dashboard and shipped four products from scratch. I own projects end-to-end: scoping, architecture, backend, APIs, admin UI, integrations, CI and deployment.</w:t>
       </w:r>
     </w:p>
     <w:p>
@@ -279,15 +279,15 @@
           <w:sz w:val="20"/>
           <w:szCs w:val="20"/>
         </w:rPr>
-        <w:t xml:space="preserve">Escalé (multi-tenant hotel operations platform): </w:t>
-      </w:r>
-      <w:r>
-        <w:rPr>
-          <w:color w:val="333333"/>
-          <w:sz w:val="20"/>
-          <w:szCs w:val="20"/>
-        </w:rPr>
-        <w:t>five apps in one TypeScript monorepo — guest mobile app, staff mobile app (iOS/Android), hotel admin, public booking site and a B2B agency portal: service requests with SLA tracking, online check-in, live chat, halls/restaurants/transport, finance and audit logs. PostgreSQL + Prisma, Redis, Meilisearch; production deployed with CI and end-to-end tests; launch-ready, first pilot hotel pending.</w:t>
+        <w:t xml:space="preserve">Escalé (multi-tenant hospitality platform for hotels and hotel groups): </w:t>
+      </w:r>
+      <w:r>
+        <w:rPr>
+          <w:color w:val="333333"/>
+          <w:sz w:val="20"/>
+          <w:szCs w:val="20"/>
+        </w:rPr>
+        <w:t>one platform any number of hotels can join, each isolated at the database level — public booking site, guest mobile app, staff mobile app and hotel admin, Arabic and English throughout. TypeScript monorepo (NestJS API, Next.js web, Expo mobile), PostgreSQL + Prisma with row-level security, Redis, Meilisearch; CI with end-to-end tests; production deployed, onboarding the first hotels next.</w:t>
       </w:r>
     </w:p>
     <w:p>
@@ -1873,7 +1873,7 @@
           <w:sz w:val="20"/>
           <w:szCs w:val="20"/>
         </w:rPr>
-        <w:t>— TypeScript monorepo, 5 apps (guest + staff mobile, admin, booking web, B2B portal), PostgreSQL/Prisma, Redis, Meilisearch. escalehotelsys.com</w:t>
+        <w:t>— multi-hotel hospitality SaaS: booking site, guest + staff mobile apps, hotel admin. NestJS · Next.js · Expo · PostgreSQL/Prisma (RLS) · Redis · Meilisearch. escalehotelsys.com</w:t>
       </w:r>
     </w:p>
     <w:p>

</xml_diff>

<commit_message>
Independent work: ongoing for years alongside roles, full-time since Sep 2026 (site EN+AR, CV)
Co-Authored-By: Claude Fable 5.1 <noreply@anthropic.com>
Claude-Session: https://claude.ai/code/session_01EYJGk8qvxriqbdb6uvegx1
</commit_message>
<xml_diff>
--- a/Ahmed_Beshir_Resume.docx
+++ b/Ahmed_Beshir_Resume.docx
@@ -150,7 +150,7 @@
           <w:sz w:val="20"/>
           <w:szCs w:val="20"/>
         </w:rPr>
-        <w:t>Software developer with 10+ years of experience building the systems that run a business: custom operations platforms on Laravel and bilingual (AR/EN) Shopify stores for companies in Egypt and the Gulf. Since September 2026 I work independently with business owners — a live-interpretation platform for conferences (Arab Wajam), a multi-tenant hospitality platform for hotels and hotel groups with guest and staff mobile apps (Escalé), a remote Qur'an recitation platform with a Telegram bot and live audio (Iqraa), and Shopify operations for Nazim Coffee. Before that I rebuilt Twindix's core dashboard and shipped four products from scratch. I own projects end-to-end: scoping, architecture, backend, APIs, admin UI, integrations, CI and deployment.</w:t>
+        <w:t>Software developer with 10+ years of experience building the systems that run a business: custom operations platforms on Laravel and bilingual (AR/EN) Shopify stores for companies in Egypt and the Gulf. I have worked with business owners independently for years and full-time since September 2026 — a live-interpretation platform for conferences (Arab Wajam), a multi-tenant hospitality platform for hotels and hotel groups with guest and staff mobile apps (Escalé), a remote Qur'an recitation platform with a Telegram bot and live audio (Iqraa), and Shopify operations for Nazim Coffee. Before that I rebuilt Twindix's core dashboard and shipped four products from scratch. I own projects end-to-end: scoping, architecture, backend, APIs, admin UI, integrations, CI and deployment.</w:t>
       </w:r>
     </w:p>
     <w:p>
@@ -216,7 +216,7 @@
           <w:szCs w:val="20"/>
         </w:rPr>
         <w:tab/>
-        <w:t>Sep 2026 – Present</w:t>
+        <w:t>Full-time since Sep 2026 · independent projects for years before</w:t>
       </w:r>
     </w:p>
     <w:p>
@@ -231,7 +231,7 @@
           <w:sz w:val="19"/>
           <w:szCs w:val="19"/>
         </w:rPr>
-        <w:t>Working directly with business owners on the systems that run their operation — scoped, built, deployed and maintained by me.</w:t>
+        <w:t>Working directly with business owners on the systems that run their operation — scoped, built, deployed and maintained by me. Independent projects ran for years alongside my roles; since September 2026 this is my full-time work.</w:t>
       </w:r>
     </w:p>
     <w:p>

</xml_diff>